<commit_message>
docs(lab08): drop O-9 line from lab report docx
Co-Authored-By: Claude Sonnet 5.5 <noreply@anthropic.com>
Claude-Session: https://claude.ai/code/session_01NS6BHZs56LnFH8wHAm8Emk
</commit_message>
<xml_diff>
--- a/SPEC/BAO_CAO_LAB_08_2314291_DoanHongTien.docx
+++ b/SPEC/BAO_CAO_LAB_08_2314291_DoanHongTien.docx
@@ -1179,26 +1179,6 @@
               <w:t>docs/seo-report.md, docs/a11y-report.md, docs/lighthouse-report.md và SPEC/BAO_CAO_LAB_08_2314291_DoanHongTien.md (mâu thuẫn, số đo, điểm lệch, cách chạy lại).</w:t>
             </w:r>
           </w:p>
-          <w:p>
-            <w:r>
-              <w:rPr>
-                <w:b/>
-                <w:color w:val="4EA72E"/>
-              </w:rPr>
-              <w:t>Chưa hoàn thành:</w:t>
-            </w:r>
-          </w:p>
-          <w:p>
-            <w:pPr>
-              <w:numPr>
-                <w:ilvl w:val="0"/>
-                <w:numId w:val="10"/>
-              </w:numPr>
-            </w:pPr>
-            <w:r>
-              <w:t>Ghi chú O-9 (metadata streaming) vào SRS_MAU_THUAN_VA_GIAI_PHAP.md chưa thêm.</w:t>
-            </w:r>
-          </w:p>
         </w:tc>
         <w:tc>
           <w:tcPr>

</xml_diff>